<commit_message>
ADDING TODAY'S WORK - 29.05.2026
</commit_message>
<xml_diff>
--- a/resources/guides/guide_links.docx
+++ b/resources/guides/guide_links.docx
@@ -281,6 +281,48 @@
           <w:t>https://bioinformatics.ccr.cancer.gov/docs/btep-coding-club/CC2023/FunctionalEnrich_clusterProfiler/</w:t>
         </w:r>
       </w:hyperlink>
+    </w:p>
+    <w:p>
+      <w:pPr>
+        <w:pStyle w:val="ListParagraph"/>
+        <w:numPr>
+          <w:ilvl w:val="1"/>
+          <w:numId w:val="2"/>
+        </w:numPr>
+      </w:pPr>
+      <w:r>
+        <w:fldChar w:fldCharType="begin"/>
+      </w:r>
+      <w:r>
+        <w:instrText>HYPERLINK "</w:instrText>
+      </w:r>
+      <w:r>
+        <w:instrText>https://biostatsquid.com/pathway-enrichment-analysis-plots/</w:instrText>
+      </w:r>
+      <w:r>
+        <w:instrText>"</w:instrText>
+      </w:r>
+      <w:r>
+        <w:fldChar w:fldCharType="separate"/>
+      </w:r>
+      <w:r>
+        <w:rPr>
+          <w:rStyle w:val="Hyperlink"/>
+        </w:rPr>
+        <w:t>https://biostatsquid.com/pathway-enrichment-analysis-plots/</w:t>
+      </w:r>
+      <w:r>
+        <w:fldChar w:fldCharType="end"/>
+      </w:r>
+    </w:p>
+    <w:p>
+      <w:pPr>
+        <w:pStyle w:val="ListParagraph"/>
+        <w:numPr>
+          <w:ilvl w:val="0"/>
+          <w:numId w:val="2"/>
+        </w:numPr>
+      </w:pPr>
     </w:p>
     <w:p>
       <w:pPr>
@@ -526,7 +568,7 @@
         <w:rFonts w:ascii="Symbol" w:hAnsi="Symbol" w:hint="default"/>
       </w:rPr>
     </w:lvl>
-    <w:lvl w:ilvl="1" w:tplc="08090003" w:tentative="1">
+    <w:lvl w:ilvl="1" w:tplc="08090003">
       <w:start w:val="1"/>
       <w:numFmt w:val="bullet"/>
       <w:lvlText w:val="o"/>

</xml_diff>

<commit_message>
ADDING TODAY'S WORK - 30.05.2026
</commit_message>
<xml_diff>
--- a/resources/guides/guide_links.docx
+++ b/resources/guides/guide_links.docx
@@ -290,30 +290,14 @@
           <w:numId w:val="2"/>
         </w:numPr>
       </w:pPr>
-      <w:r>
-        <w:fldChar w:fldCharType="begin"/>
-      </w:r>
-      <w:r>
-        <w:instrText>HYPERLINK "</w:instrText>
-      </w:r>
-      <w:r>
-        <w:instrText>https://biostatsquid.com/pathway-enrichment-analysis-plots/</w:instrText>
-      </w:r>
-      <w:r>
-        <w:instrText>"</w:instrText>
-      </w:r>
-      <w:r>
-        <w:fldChar w:fldCharType="separate"/>
-      </w:r>
-      <w:r>
-        <w:rPr>
-          <w:rStyle w:val="Hyperlink"/>
-        </w:rPr>
-        <w:t>https://biostatsquid.com/pathway-enrichment-analysis-plots/</w:t>
-      </w:r>
-      <w:r>
-        <w:fldChar w:fldCharType="end"/>
-      </w:r>
+      <w:hyperlink r:id="rId14" w:history="1">
+        <w:r>
+          <w:rPr>
+            <w:rStyle w:val="Hyperlink"/>
+          </w:rPr>
+          <w:t>https://biostatsquid.com/pathway-enrichment-analysis-plots/</w:t>
+        </w:r>
+      </w:hyperlink>
     </w:p>
     <w:p>
       <w:pPr>
@@ -323,6 +307,57 @@
           <w:numId w:val="2"/>
         </w:numPr>
       </w:pPr>
+      <w:proofErr w:type="spellStart"/>
+      <w:r>
+        <w:t>clusterProfiler</w:t>
+      </w:r>
+      <w:proofErr w:type="spellEnd"/>
+      <w:r>
+        <w:t xml:space="preserve"> vignette </w:t>
+      </w:r>
+      <w:r>
+        <w:sym w:font="Wingdings" w:char="F0E0"/>
+      </w:r>
+      <w:r>
+        <w:t xml:space="preserve"> </w:t>
+      </w:r>
+      <w:hyperlink r:id="rId15" w:history="1">
+        <w:r>
+          <w:rPr>
+            <w:rStyle w:val="Hyperlink"/>
+          </w:rPr>
+          <w:t>https://yulab-smu.top/biomedical-knowledge-mining-book/</w:t>
+        </w:r>
+      </w:hyperlink>
+    </w:p>
+    <w:p>
+      <w:pPr>
+        <w:pStyle w:val="ListParagraph"/>
+        <w:numPr>
+          <w:ilvl w:val="1"/>
+          <w:numId w:val="2"/>
+        </w:numPr>
+      </w:pPr>
+      <w:r>
+        <w:t xml:space="preserve">Contains GO, KEGG, </w:t>
+      </w:r>
+      <w:proofErr w:type="spellStart"/>
+      <w:r>
+        <w:t>Reactome</w:t>
+      </w:r>
+      <w:proofErr w:type="spellEnd"/>
+    </w:p>
+    <w:p>
+      <w:pPr>
+        <w:pStyle w:val="ListParagraph"/>
+        <w:numPr>
+          <w:ilvl w:val="1"/>
+          <w:numId w:val="2"/>
+        </w:numPr>
+      </w:pPr>
+      <w:r>
+        <w:t>Contains visualisation</w:t>
+      </w:r>
     </w:p>
     <w:p>
       <w:pPr>

</xml_diff>

<commit_message>
ADDING TODAY'S WORK - 03.06.2026
</commit_message>
<xml_diff>
--- a/resources/guides/guide_links.docx
+++ b/resources/guides/guide_links.docx
@@ -358,6 +358,97 @@
       <w:r>
         <w:t>Contains visualisation</w:t>
       </w:r>
+    </w:p>
+    <w:p>
+      <w:pPr>
+        <w:pStyle w:val="ListParagraph"/>
+        <w:numPr>
+          <w:ilvl w:val="0"/>
+          <w:numId w:val="2"/>
+        </w:numPr>
+      </w:pPr>
+      <w:r>
+        <w:rPr>
+          <w:b/>
+          <w:bCs/>
+        </w:rPr>
+        <w:t>Qiagen</w:t>
+      </w:r>
+      <w:r>
+        <w:t xml:space="preserve"> pathway analysis guide </w:t>
+      </w:r>
+      <w:r>
+        <w:sym w:font="Wingdings" w:char="F0E0"/>
+      </w:r>
+      <w:r>
+        <w:t xml:space="preserve"> </w:t>
+      </w:r>
+      <w:hyperlink r:id="rId16" w:history="1">
+        <w:r>
+          <w:rPr>
+            <w:rStyle w:val="Hyperlink"/>
+          </w:rPr>
+          <w:t>https://tv.qiagenbioinformatics.com/video/83851520/ipa-deeper-dive-mirna-investigation-1</w:t>
+        </w:r>
+      </w:hyperlink>
+    </w:p>
+    <w:p>
+      <w:pPr>
+        <w:pStyle w:val="ListParagraph"/>
+        <w:numPr>
+          <w:ilvl w:val="1"/>
+          <w:numId w:val="2"/>
+        </w:numPr>
+      </w:pPr>
+      <w:r>
+        <w:t xml:space="preserve">(21min 30 secs for </w:t>
+      </w:r>
+      <w:r>
+        <w:t>miRNA-</w:t>
+      </w:r>
+      <w:proofErr w:type="spellStart"/>
+      <w:r>
+        <w:t>mRNA_matches_with</w:t>
+      </w:r>
+      <w:proofErr w:type="spellEnd"/>
+      <w:r>
+        <w:t xml:space="preserve"> prediction scores</w:t>
+      </w:r>
+      <w:r>
+        <w:t>.xlsx guide)</w:t>
+      </w:r>
+    </w:p>
+    <w:p>
+      <w:pPr>
+        <w:pStyle w:val="ListParagraph"/>
+        <w:numPr>
+          <w:ilvl w:val="1"/>
+          <w:numId w:val="2"/>
+        </w:numPr>
+      </w:pPr>
+      <w:r>
+        <w:t xml:space="preserve">Slide deck </w:t>
+      </w:r>
+      <w:r>
+        <w:sym w:font="Wingdings" w:char="F0E0"/>
+      </w:r>
+      <w:r>
+        <w:t xml:space="preserve"> </w:t>
+      </w:r>
+      <w:hyperlink r:id="rId17" w:history="1">
+        <w:r>
+          <w:rPr>
+            <w:rStyle w:val="Hyperlink"/>
+          </w:rPr>
+          <w:t>https://digitalinsights.qiagen.com/wp-content/uploads/2025/12/IPA-miRNA-Slide-Deck-1.pdf</w:t>
+        </w:r>
+      </w:hyperlink>
+    </w:p>
+    <w:p>
+      <w:pPr>
+        <w:pStyle w:val="ListParagraph"/>
+        <w:ind w:left="1440"/>
+      </w:pPr>
     </w:p>
     <w:p>
       <w:pPr>

</xml_diff>